<commit_message>
Se Agregaron Reportes, Se corrigio Calculo de las Edades actuales, Sesion de usuario extendida, se cambio el favicon y se extendieron el rango de las fechas
</commit_message>
<xml_diff>
--- a/Causa de Baja/Invalides Provisoria [Nombre completo y DNI del agente].docx
+++ b/Causa de Baja/Invalides Provisoria [Nombre completo y DNI del agente].docx
@@ -1,6 +1,6 @@
 
 <file path=word/document.xml><?xml version="1.0" encoding="utf-8"?>
-<w:document xmlns:wpc="http://schemas.microsoft.com/office/word/2010/wordprocessingCanvas" xmlns:cx="http://schemas.microsoft.com/office/drawing/2014/chartex" xmlns:cx1="http://schemas.microsoft.com/office/drawing/2015/9/8/chartex" xmlns:cx2="http://schemas.microsoft.com/office/drawing/2015/10/21/chartex" xmlns:cx3="http://schemas.microsoft.com/office/drawing/2016/5/9/chartex" xmlns:cx4="http://schemas.microsoft.com/office/drawing/2016/5/10/chartex" xmlns:cx5="http://schemas.microsoft.com/office/drawing/2016/5/11/chartex" xmlns:cx6="http://schemas.microsoft.com/office/drawing/2016/5/12/chartex" xmlns:cx7="http://schemas.microsoft.com/office/drawing/2016/5/13/chartex" xmlns:cx8="http://schemas.microsoft.com/office/drawing/2016/5/14/chartex" xmlns:mc="http://schemas.openxmlformats.org/markup-compatibility/2006" xmlns:aink="http://schemas.microsoft.com/office/drawing/2016/ink" xmlns:am3d="http://schemas.microsoft.com/office/drawing/2017/model3d" xmlns:o="urn:schemas-microsoft-com:office:office" xmlns:r="http://schemas.openxmlformats.org/officeDocument/2006/relationships" xmlns:m="http://schemas.openxmlformats.org/officeDocument/2006/math" xmlns:v="urn:schemas-microsoft-com:vml" xmlns:wp14="http://schemas.microsoft.com/office/word/2010/wordprocessingDrawing" xmlns:wp="http://schemas.openxmlformats.org/drawingml/2006/wordprocessingDrawing" xmlns:w10="urn:schemas-microsoft-com:office:word" xmlns:w="http://schemas.openxmlformats.org/wordprocessingml/2006/main" xmlns:w14="http://schemas.microsoft.com/office/word/2010/wordml" xmlns:w15="http://schemas.microsoft.com/office/word/2012/wordml" xmlns:w16cid="http://schemas.microsoft.com/office/word/2016/wordml/cid" xmlns:w16se="http://schemas.microsoft.com/office/word/2015/wordml/symex" xmlns:wpg="http://schemas.microsoft.com/office/word/2010/wordprocessingGroup" xmlns:wpi="http://schemas.microsoft.com/office/word/2010/wordprocessingInk" xmlns:wne="http://schemas.microsoft.com/office/word/2006/wordml" xmlns:wps="http://schemas.microsoft.com/office/word/2010/wordprocessingShape" mc:Ignorable="w14 w15 w16se w16cid wp14">
+<w:document xmlns:wpc="http://schemas.microsoft.com/office/word/2010/wordprocessingCanvas" xmlns:cx="http://schemas.microsoft.com/office/drawing/2014/chartex" xmlns:cx1="http://schemas.microsoft.com/office/drawing/2015/9/8/chartex" xmlns:cx2="http://schemas.microsoft.com/office/drawing/2015/10/21/chartex" xmlns:cx3="http://schemas.microsoft.com/office/drawing/2016/5/9/chartex" xmlns:cx4="http://schemas.microsoft.com/office/drawing/2016/5/10/chartex" xmlns:cx5="http://schemas.microsoft.com/office/drawing/2016/5/11/chartex" xmlns:cx6="http://schemas.microsoft.com/office/drawing/2016/5/12/chartex" xmlns:cx7="http://schemas.microsoft.com/office/drawing/2016/5/13/chartex" xmlns:cx8="http://schemas.microsoft.com/office/drawing/2016/5/14/chartex" xmlns:mc="http://schemas.openxmlformats.org/markup-compatibility/2006" xmlns:aink="http://schemas.microsoft.com/office/drawing/2016/ink" xmlns:am3d="http://schemas.microsoft.com/office/drawing/2017/model3d" xmlns:o="urn:schemas-microsoft-com:office:office" xmlns:oel="http://schemas.microsoft.com/office/2019/extlst" xmlns:r="http://schemas.openxmlformats.org/officeDocument/2006/relationships" xmlns:m="http://schemas.openxmlformats.org/officeDocument/2006/math" xmlns:v="urn:schemas-microsoft-com:vml" xmlns:wp14="http://schemas.microsoft.com/office/word/2010/wordprocessingDrawing" xmlns:wp="http://schemas.openxmlformats.org/drawingml/2006/wordprocessingDrawing" xmlns:w10="urn:schemas-microsoft-com:office:word" xmlns:w="http://schemas.openxmlformats.org/wordprocessingml/2006/main" xmlns:w14="http://schemas.microsoft.com/office/word/2010/wordml" xmlns:w15="http://schemas.microsoft.com/office/word/2012/wordml" xmlns:w16cex="http://schemas.microsoft.com/office/word/2018/wordml/cex" xmlns:w16cid="http://schemas.microsoft.com/office/word/2016/wordml/cid" xmlns:w16="http://schemas.microsoft.com/office/word/2018/wordml" xmlns:w16sdtdh="http://schemas.microsoft.com/office/word/2020/wordml/sdtdatahash" xmlns:w16se="http://schemas.microsoft.com/office/word/2015/wordml/symex" xmlns:wpg="http://schemas.microsoft.com/office/word/2010/wordprocessingGroup" xmlns:wpi="http://schemas.microsoft.com/office/word/2010/wordprocessingInk" xmlns:wne="http://schemas.microsoft.com/office/word/2006/wordml" xmlns:wps="http://schemas.microsoft.com/office/word/2010/wordprocessingShape" mc:Ignorable="w14 w15 w16se w16cid w16 w16cex w16sdtdh wp14">
   <w:body>
     <w:p>
       <w:pPr>
@@ -22,8 +22,34 @@
           <w:sz w:val="24"/>
           <w:lang w:val="es-AR"/>
         </w:rPr>
-        <w:t>Córdoba, 29 de julio de 2026.-</w:t>
+        <w:t xml:space="preserve">Córdoba, </w:t>
       </w:r>
+      <w:r>
+        <w:rPr>
+          <w:b/>
+          <w:bCs/>
+          <w:color w:val="auto"/>
+        </w:rPr>
+        <w:t>[ FECHA ACTUAL</w:t>
+      </w:r>
+      <w:proofErr w:type="gramStart"/>
+      <w:r>
+        <w:rPr>
+          <w:b/>
+          <w:bCs/>
+          <w:color w:val="auto"/>
+        </w:rPr>
+        <w:t>]</w:t>
+      </w:r>
+      <w:r>
+        <w:rPr>
+          <w:color w:val="auto"/>
+          <w:sz w:val="24"/>
+          <w:lang w:val="es-AR"/>
+        </w:rPr>
+        <w:t>.-</w:t>
+      </w:r>
+      <w:proofErr w:type="gramEnd"/>
     </w:p>
     <w:p>
       <w:pPr>
@@ -59,8 +85,42 @@
           <w:sz w:val="24"/>
           <w:lang w:val="es-AR"/>
         </w:rPr>
-        <w:t>: 020646/2026.-</w:t>
+        <w:t xml:space="preserve">: </w:t>
       </w:r>
+      <w:r>
+        <w:rPr>
+          <w:b/>
+          <w:bCs/>
+          <w:color w:val="auto"/>
+        </w:rPr>
+        <w:t xml:space="preserve">[ </w:t>
+      </w:r>
+      <w:r>
+        <w:rPr>
+          <w:b/>
+          <w:bCs/>
+          <w:color w:val="auto"/>
+        </w:rPr>
+        <w:t>N EXP MUN RENUNCIA</w:t>
+      </w:r>
+      <w:proofErr w:type="gramStart"/>
+      <w:r>
+        <w:rPr>
+          <w:b/>
+          <w:bCs/>
+          <w:color w:val="auto"/>
+        </w:rPr>
+        <w:t>]</w:t>
+      </w:r>
+      <w:r>
+        <w:rPr>
+          <w:color w:val="auto"/>
+          <w:sz w:val="24"/>
+          <w:lang w:val="es-AR"/>
+        </w:rPr>
+        <w:t>.-</w:t>
+      </w:r>
+      <w:proofErr w:type="gramEnd"/>
     </w:p>
     <w:p>
       <w:pPr>
@@ -84,11 +144,29 @@
       <w:r>
         <w:rPr>
           <w:b/>
+          <w:bCs/>
+          <w:color w:val="auto"/>
+        </w:rPr>
+        <w:t xml:space="preserve">[ NOMBRE </w:t>
+      </w:r>
+      <w:proofErr w:type="gramStart"/>
+      <w:r>
+        <w:rPr>
+          <w:b/>
+          <w:bCs/>
+          <w:color w:val="auto"/>
+        </w:rPr>
+        <w:t>COMPLETO ]</w:t>
+      </w:r>
+      <w:proofErr w:type="gramEnd"/>
+      <w:r>
+        <w:rPr>
+          <w:b/>
           <w:color w:val="auto"/>
           <w:sz w:val="24"/>
           <w:lang w:val="es-AR"/>
         </w:rPr>
-        <w:t xml:space="preserve">BASUALDO WALTER DANIEL, CUIL </w:t>
+        <w:t xml:space="preserve">, CUIL </w:t>
       </w:r>
       <w:proofErr w:type="spellStart"/>
       <w:r>
@@ -108,7 +186,70 @@
           <w:sz w:val="24"/>
           <w:lang w:val="es-AR"/>
         </w:rPr>
-        <w:t>: 20-17000153-3, CARGO: 0617 MAESTRANZA NIVEL 17</w:t>
+        <w:t xml:space="preserve">: </w:t>
+      </w:r>
+      <w:r>
+        <w:rPr>
+          <w:b/>
+          <w:bCs/>
+          <w:color w:val="auto"/>
+          <w:sz w:val="24"/>
+        </w:rPr>
+        <w:t>[</w:t>
+      </w:r>
+      <w:r>
+        <w:rPr>
+          <w:b/>
+          <w:bCs/>
+          <w:color w:val="auto"/>
+          <w:sz w:val="24"/>
+        </w:rPr>
+        <w:t xml:space="preserve"> CUIL </w:t>
+      </w:r>
+      <w:r>
+        <w:rPr>
+          <w:b/>
+          <w:bCs/>
+          <w:color w:val="auto"/>
+          <w:sz w:val="24"/>
+        </w:rPr>
+        <w:t>]</w:t>
+      </w:r>
+      <w:r>
+        <w:rPr>
+          <w:b/>
+          <w:color w:val="auto"/>
+          <w:sz w:val="24"/>
+          <w:lang w:val="es-AR"/>
+        </w:rPr>
+        <w:t xml:space="preserve">, CARGO: </w:t>
+      </w:r>
+      <w:r>
+        <w:rPr>
+          <w:b/>
+          <w:bCs/>
+          <w:color w:val="auto"/>
+          <w:sz w:val="24"/>
+        </w:rPr>
+        <w:t>[</w:t>
+      </w:r>
+      <w:r>
+        <w:rPr>
+          <w:b/>
+          <w:bCs/>
+          <w:color w:val="auto"/>
+          <w:sz w:val="24"/>
+        </w:rPr>
+        <w:t xml:space="preserve"> CARGO </w:t>
+      </w:r>
+      <w:r>
+        <w:rPr>
+          <w:b/>
+          <w:bCs/>
+          <w:color w:val="auto"/>
+          <w:sz w:val="24"/>
+        </w:rPr>
+        <w:t>]</w:t>
       </w:r>
       <w:r>
         <w:rPr>
@@ -121,11 +262,38 @@
       <w:r>
         <w:rPr>
           <w:b/>
+          <w:bCs/>
           <w:color w:val="auto"/>
           <w:sz w:val="24"/>
-          <w:lang w:val="es-AR"/>
         </w:rPr>
-        <w:t>DIRECCION GENERAL DE ALUMBRADO PUBLICO - MANTENIMIENTO</w:t>
+        <w:t>[</w:t>
+      </w:r>
+      <w:r>
+        <w:rPr>
+          <w:b/>
+          <w:bCs/>
+          <w:color w:val="auto"/>
+          <w:sz w:val="24"/>
+        </w:rPr>
+        <w:t xml:space="preserve"> PROGRAMA </w:t>
+      </w:r>
+      <w:r>
+        <w:rPr>
+          <w:b/>
+          <w:bCs/>
+          <w:color w:val="auto"/>
+          <w:sz w:val="24"/>
+        </w:rPr>
+        <w:t>]</w:t>
+      </w:r>
+      <w:r>
+        <w:rPr>
+          <w:b/>
+          <w:bCs/>
+          <w:color w:val="auto"/>
+          <w:sz w:val="24"/>
+        </w:rPr>
+        <w:t xml:space="preserve"> </w:t>
       </w:r>
       <w:r>
         <w:rPr>
@@ -133,7 +301,7 @@
           <w:sz w:val="24"/>
           <w:lang w:val="es-AR"/>
         </w:rPr>
-        <w:t xml:space="preserve"> considerando:</w:t>
+        <w:t>considerando:</w:t>
       </w:r>
     </w:p>
     <w:p>
@@ -182,8 +350,64 @@
           <w:sz w:val="24"/>
           <w:lang w:val="es-AR"/>
         </w:rPr>
-        <w:t>: 000461/2026</w:t>
+        <w:t xml:space="preserve">: </w:t>
       </w:r>
+      <w:r>
+        <w:rPr>
+          <w:b/>
+          <w:bCs/>
+          <w:color w:val="auto"/>
+          <w:sz w:val="24"/>
+        </w:rPr>
+        <w:t>[</w:t>
+      </w:r>
+      <w:r>
+        <w:rPr>
+          <w:b/>
+          <w:bCs/>
+          <w:color w:val="auto"/>
+          <w:sz w:val="24"/>
+        </w:rPr>
+        <w:t xml:space="preserve"> </w:t>
+      </w:r>
+      <w:r>
+        <w:rPr>
+          <w:b/>
+          <w:bCs/>
+          <w:color w:val="auto"/>
+          <w:sz w:val="24"/>
+        </w:rPr>
+        <w:t xml:space="preserve">N RES </w:t>
+      </w:r>
+      <w:proofErr w:type="gramStart"/>
+      <w:r>
+        <w:rPr>
+          <w:b/>
+          <w:bCs/>
+          <w:color w:val="auto"/>
+          <w:sz w:val="24"/>
+        </w:rPr>
+        <w:t>CAJA</w:t>
+      </w:r>
+      <w:r>
+        <w:rPr>
+          <w:b/>
+          <w:bCs/>
+          <w:color w:val="auto"/>
+          <w:sz w:val="24"/>
+        </w:rPr>
+        <w:t xml:space="preserve"> </w:t>
+      </w:r>
+      <w:r>
+        <w:rPr>
+          <w:b/>
+          <w:bCs/>
+          <w:color w:val="auto"/>
+          <w:sz w:val="24"/>
+        </w:rPr>
+        <w:t>]</w:t>
+      </w:r>
+      <w:proofErr w:type="gramEnd"/>
       <w:r>
         <w:rPr>
           <w:color w:val="auto"/>
@@ -208,7 +432,60 @@
           <w:sz w:val="24"/>
           <w:lang w:val="es-AR"/>
         </w:rPr>
-        <w:t xml:space="preserve"> J- 0124-250205/2026, deberá aceptarse la </w:t>
+        <w:t xml:space="preserve"> J- </w:t>
+      </w:r>
+      <w:r>
+        <w:rPr>
+          <w:b/>
+          <w:bCs/>
+          <w:color w:val="auto"/>
+          <w:sz w:val="24"/>
+        </w:rPr>
+        <w:t>[</w:t>
+      </w:r>
+      <w:r>
+        <w:rPr>
+          <w:b/>
+          <w:bCs/>
+          <w:color w:val="auto"/>
+          <w:sz w:val="24"/>
+        </w:rPr>
+        <w:t xml:space="preserve"> </w:t>
+      </w:r>
+      <w:r>
+        <w:rPr>
+          <w:b/>
+          <w:bCs/>
+          <w:color w:val="auto"/>
+          <w:sz w:val="24"/>
+        </w:rPr>
+        <w:t>J N EXP CAJA</w:t>
+      </w:r>
+      <w:r>
+        <w:rPr>
+          <w:b/>
+          <w:bCs/>
+          <w:color w:val="auto"/>
+          <w:sz w:val="24"/>
+        </w:rPr>
+        <w:t xml:space="preserve"> </w:t>
+      </w:r>
+      <w:r>
+        <w:rPr>
+          <w:b/>
+          <w:bCs/>
+          <w:color w:val="auto"/>
+          <w:sz w:val="24"/>
+        </w:rPr>
+        <w:t>]</w:t>
+      </w:r>
+      <w:r>
+        <w:rPr>
+          <w:color w:val="auto"/>
+          <w:sz w:val="24"/>
+          <w:lang w:val="es-AR"/>
+        </w:rPr>
+        <w:t xml:space="preserve">, deberá aceptarse la </w:t>
       </w:r>
       <w:r>
         <w:rPr>
@@ -256,11 +533,56 @@
       <w:r>
         <w:rPr>
           <w:b/>
+          <w:bCs/>
           <w:color w:val="auto"/>
           <w:sz w:val="24"/>
-          <w:lang w:val="es-AR"/>
         </w:rPr>
-        <w:t>01/08/2026</w:t>
+        <w:t>[</w:t>
+      </w:r>
+      <w:r>
+        <w:rPr>
+          <w:b/>
+          <w:bCs/>
+          <w:color w:val="auto"/>
+          <w:sz w:val="24"/>
+        </w:rPr>
+        <w:t xml:space="preserve"> </w:t>
+      </w:r>
+      <w:r>
+        <w:rPr>
+          <w:b/>
+          <w:bCs/>
+          <w:color w:val="auto"/>
+          <w:sz w:val="24"/>
+        </w:rPr>
+        <w:t>FECHA DESDE PROVISORIA</w:t>
+      </w:r>
+      <w:r>
+        <w:rPr>
+          <w:b/>
+          <w:bCs/>
+          <w:color w:val="auto"/>
+          <w:sz w:val="24"/>
+        </w:rPr>
+        <w:t xml:space="preserve"> </w:t>
+      </w:r>
+      <w:r>
+        <w:rPr>
+          <w:b/>
+          <w:bCs/>
+          <w:color w:val="auto"/>
+          <w:sz w:val="24"/>
+        </w:rPr>
+        <w:t>]</w:t>
+      </w:r>
+      <w:r>
+        <w:rPr>
+          <w:b/>
+          <w:bCs/>
+          <w:color w:val="auto"/>
+          <w:sz w:val="24"/>
+        </w:rPr>
+        <w:t xml:space="preserve"> </w:t>
       </w:r>
       <w:r>
         <w:rPr>
@@ -268,16 +590,52 @@
           <w:sz w:val="24"/>
           <w:lang w:val="es-AR"/>
         </w:rPr>
-        <w:t xml:space="preserve"> y cuyo vencimiento operará con fecha </w:t>
+        <w:t xml:space="preserve">y cuyo vencimiento operará con fecha </w:t>
       </w:r>
       <w:r>
         <w:rPr>
           <w:b/>
+          <w:bCs/>
           <w:color w:val="auto"/>
           <w:sz w:val="24"/>
-          <w:lang w:val="es-AR"/>
         </w:rPr>
-        <w:t>31/07/2028</w:t>
+        <w:t>[</w:t>
+      </w:r>
+      <w:r>
+        <w:rPr>
+          <w:b/>
+          <w:bCs/>
+          <w:color w:val="auto"/>
+          <w:sz w:val="24"/>
+        </w:rPr>
+        <w:t xml:space="preserve"> FECHA </w:t>
+      </w:r>
+      <w:r>
+        <w:rPr>
+          <w:b/>
+          <w:bCs/>
+          <w:color w:val="auto"/>
+          <w:sz w:val="24"/>
+        </w:rPr>
+        <w:t xml:space="preserve">HASTA </w:t>
+      </w:r>
+      <w:r>
+        <w:rPr>
+          <w:b/>
+          <w:bCs/>
+          <w:color w:val="auto"/>
+          <w:sz w:val="24"/>
+        </w:rPr>
+        <w:t xml:space="preserve">PROVISORIA </w:t>
+      </w:r>
+      <w:r>
+        <w:rPr>
+          <w:b/>
+          <w:bCs/>
+          <w:color w:val="auto"/>
+          <w:sz w:val="24"/>
+        </w:rPr>
+        <w:t>]</w:t>
       </w:r>
       <w:r>
         <w:rPr>
@@ -390,8 +748,6 @@
         </w:rPr>
         <w:t xml:space="preserve">Dirección General de ART y Control Legal </w:t>
       </w:r>
-      <w:bookmarkStart w:id="0" w:name="_GoBack"/>
-      <w:bookmarkEnd w:id="0"/>
       <w:r>
         <w:rPr>
           <w:color w:val="auto"/>
@@ -439,7 +795,7 @@
 </file>
 
 <file path=word/endnotes.xml><?xml version="1.0" encoding="utf-8"?>
-<w:endnotes xmlns:wpc="http://schemas.microsoft.com/office/word/2010/wordprocessingCanvas" xmlns:cx="http://schemas.microsoft.com/office/drawing/2014/chartex" xmlns:cx1="http://schemas.microsoft.com/office/drawing/2015/9/8/chartex" xmlns:cx2="http://schemas.microsoft.com/office/drawing/2015/10/21/chartex" xmlns:cx3="http://schemas.microsoft.com/office/drawing/2016/5/9/chartex" xmlns:cx4="http://schemas.microsoft.com/office/drawing/2016/5/10/chartex" xmlns:cx5="http://schemas.microsoft.com/office/drawing/2016/5/11/chartex" xmlns:cx6="http://schemas.microsoft.com/office/drawing/2016/5/12/chartex" xmlns:cx7="http://schemas.microsoft.com/office/drawing/2016/5/13/chartex" xmlns:cx8="http://schemas.microsoft.com/office/drawing/2016/5/14/chartex" xmlns:mc="http://schemas.openxmlformats.org/markup-compatibility/2006" xmlns:aink="http://schemas.microsoft.com/office/drawing/2016/ink" xmlns:am3d="http://schemas.microsoft.com/office/drawing/2017/model3d" xmlns:o="urn:schemas-microsoft-com:office:office" xmlns:r="http://schemas.openxmlformats.org/officeDocument/2006/relationships" xmlns:m="http://schemas.openxmlformats.org/officeDocument/2006/math" xmlns:v="urn:schemas-microsoft-com:vml" xmlns:wp14="http://schemas.microsoft.com/office/word/2010/wordprocessingDrawing" xmlns:wp="http://schemas.openxmlformats.org/drawingml/2006/wordprocessingDrawing" xmlns:w10="urn:schemas-microsoft-com:office:word" xmlns:w="http://schemas.openxmlformats.org/wordprocessingml/2006/main" xmlns:w14="http://schemas.microsoft.com/office/word/2010/wordml" xmlns:w15="http://schemas.microsoft.com/office/word/2012/wordml" xmlns:w16cid="http://schemas.microsoft.com/office/word/2016/wordml/cid" xmlns:w16se="http://schemas.microsoft.com/office/word/2015/wordml/symex" xmlns:wpg="http://schemas.microsoft.com/office/word/2010/wordprocessingGroup" xmlns:wpi="http://schemas.microsoft.com/office/word/2010/wordprocessingInk" xmlns:wne="http://schemas.microsoft.com/office/word/2006/wordml" xmlns:wps="http://schemas.microsoft.com/office/word/2010/wordprocessingShape" mc:Ignorable="w14 w15 w16se w16cid wp14">
+<w:endnotes xmlns:wpc="http://schemas.microsoft.com/office/word/2010/wordprocessingCanvas" xmlns:cx="http://schemas.microsoft.com/office/drawing/2014/chartex" xmlns:cx1="http://schemas.microsoft.com/office/drawing/2015/9/8/chartex" xmlns:cx2="http://schemas.microsoft.com/office/drawing/2015/10/21/chartex" xmlns:cx3="http://schemas.microsoft.com/office/drawing/2016/5/9/chartex" xmlns:cx4="http://schemas.microsoft.com/office/drawing/2016/5/10/chartex" xmlns:cx5="http://schemas.microsoft.com/office/drawing/2016/5/11/chartex" xmlns:cx6="http://schemas.microsoft.com/office/drawing/2016/5/12/chartex" xmlns:cx7="http://schemas.microsoft.com/office/drawing/2016/5/13/chartex" xmlns:cx8="http://schemas.microsoft.com/office/drawing/2016/5/14/chartex" xmlns:mc="http://schemas.openxmlformats.org/markup-compatibility/2006" xmlns:aink="http://schemas.microsoft.com/office/drawing/2016/ink" xmlns:am3d="http://schemas.microsoft.com/office/drawing/2017/model3d" xmlns:o="urn:schemas-microsoft-com:office:office" xmlns:oel="http://schemas.microsoft.com/office/2019/extlst" xmlns:r="http://schemas.openxmlformats.org/officeDocument/2006/relationships" xmlns:m="http://schemas.openxmlformats.org/officeDocument/2006/math" xmlns:v="urn:schemas-microsoft-com:vml" xmlns:wp14="http://schemas.microsoft.com/office/word/2010/wordprocessingDrawing" xmlns:wp="http://schemas.openxmlformats.org/drawingml/2006/wordprocessingDrawing" xmlns:w10="urn:schemas-microsoft-com:office:word" xmlns:w="http://schemas.openxmlformats.org/wordprocessingml/2006/main" xmlns:w14="http://schemas.microsoft.com/office/word/2010/wordml" xmlns:w15="http://schemas.microsoft.com/office/word/2012/wordml" xmlns:w16cex="http://schemas.microsoft.com/office/word/2018/wordml/cex" xmlns:w16cid="http://schemas.microsoft.com/office/word/2016/wordml/cid" xmlns:w16="http://schemas.microsoft.com/office/word/2018/wordml" xmlns:w16sdtdh="http://schemas.microsoft.com/office/word/2020/wordml/sdtdatahash" xmlns:w16se="http://schemas.microsoft.com/office/word/2015/wordml/symex" xmlns:wpg="http://schemas.microsoft.com/office/word/2010/wordprocessingGroup" xmlns:wpi="http://schemas.microsoft.com/office/word/2010/wordprocessingInk" xmlns:wne="http://schemas.microsoft.com/office/word/2006/wordml" xmlns:wps="http://schemas.microsoft.com/office/word/2010/wordprocessingShape" mc:Ignorable="w14 w15 w16se w16cid w16 w16cex w16sdtdh wp14">
   <w:endnote w:type="separator" w:id="-1">
     <w:p>
       <w:pPr>
@@ -464,7 +820,7 @@
 </file>
 
 <file path=word/footer1.xml><?xml version="1.0" encoding="utf-8"?>
-<w:ftr xmlns:wpc="http://schemas.microsoft.com/office/word/2010/wordprocessingCanvas" xmlns:cx="http://schemas.microsoft.com/office/drawing/2014/chartex" xmlns:cx1="http://schemas.microsoft.com/office/drawing/2015/9/8/chartex" xmlns:cx2="http://schemas.microsoft.com/office/drawing/2015/10/21/chartex" xmlns:cx3="http://schemas.microsoft.com/office/drawing/2016/5/9/chartex" xmlns:cx4="http://schemas.microsoft.com/office/drawing/2016/5/10/chartex" xmlns:cx5="http://schemas.microsoft.com/office/drawing/2016/5/11/chartex" xmlns:cx6="http://schemas.microsoft.com/office/drawing/2016/5/12/chartex" xmlns:cx7="http://schemas.microsoft.com/office/drawing/2016/5/13/chartex" xmlns:cx8="http://schemas.microsoft.com/office/drawing/2016/5/14/chartex" xmlns:mc="http://schemas.openxmlformats.org/markup-compatibility/2006" xmlns:aink="http://schemas.microsoft.com/office/drawing/2016/ink" xmlns:am3d="http://schemas.microsoft.com/office/drawing/2017/model3d" xmlns:o="urn:schemas-microsoft-com:office:office" xmlns:r="http://schemas.openxmlformats.org/officeDocument/2006/relationships" xmlns:m="http://schemas.openxmlformats.org/officeDocument/2006/math" xmlns:v="urn:schemas-microsoft-com:vml" xmlns:wp14="http://schemas.microsoft.com/office/word/2010/wordprocessingDrawing" xmlns:wp="http://schemas.openxmlformats.org/drawingml/2006/wordprocessingDrawing" xmlns:w10="urn:schemas-microsoft-com:office:word" xmlns:w="http://schemas.openxmlformats.org/wordprocessingml/2006/main" xmlns:w14="http://schemas.microsoft.com/office/word/2010/wordml" xmlns:w15="http://schemas.microsoft.com/office/word/2012/wordml" xmlns:w16cid="http://schemas.microsoft.com/office/word/2016/wordml/cid" xmlns:w16se="http://schemas.microsoft.com/office/word/2015/wordml/symex" xmlns:wpg="http://schemas.microsoft.com/office/word/2010/wordprocessingGroup" xmlns:wpi="http://schemas.microsoft.com/office/word/2010/wordprocessingInk" xmlns:wne="http://schemas.microsoft.com/office/word/2006/wordml" xmlns:wps="http://schemas.microsoft.com/office/word/2010/wordprocessingShape" mc:Ignorable="w14 w15 w16se w16cid wp14">
+<w:ftr xmlns:wpc="http://schemas.microsoft.com/office/word/2010/wordprocessingCanvas" xmlns:cx="http://schemas.microsoft.com/office/drawing/2014/chartex" xmlns:cx1="http://schemas.microsoft.com/office/drawing/2015/9/8/chartex" xmlns:cx2="http://schemas.microsoft.com/office/drawing/2015/10/21/chartex" xmlns:cx3="http://schemas.microsoft.com/office/drawing/2016/5/9/chartex" xmlns:cx4="http://schemas.microsoft.com/office/drawing/2016/5/10/chartex" xmlns:cx5="http://schemas.microsoft.com/office/drawing/2016/5/11/chartex" xmlns:cx6="http://schemas.microsoft.com/office/drawing/2016/5/12/chartex" xmlns:cx7="http://schemas.microsoft.com/office/drawing/2016/5/13/chartex" xmlns:cx8="http://schemas.microsoft.com/office/drawing/2016/5/14/chartex" xmlns:mc="http://schemas.openxmlformats.org/markup-compatibility/2006" xmlns:aink="http://schemas.microsoft.com/office/drawing/2016/ink" xmlns:am3d="http://schemas.microsoft.com/office/drawing/2017/model3d" xmlns:o="urn:schemas-microsoft-com:office:office" xmlns:oel="http://schemas.microsoft.com/office/2019/extlst" xmlns:r="http://schemas.openxmlformats.org/officeDocument/2006/relationships" xmlns:m="http://schemas.openxmlformats.org/officeDocument/2006/math" xmlns:v="urn:schemas-microsoft-com:vml" xmlns:wp14="http://schemas.microsoft.com/office/word/2010/wordprocessingDrawing" xmlns:wp="http://schemas.openxmlformats.org/drawingml/2006/wordprocessingDrawing" xmlns:w10="urn:schemas-microsoft-com:office:word" xmlns:w="http://schemas.openxmlformats.org/wordprocessingml/2006/main" xmlns:w14="http://schemas.microsoft.com/office/word/2010/wordml" xmlns:w15="http://schemas.microsoft.com/office/word/2012/wordml" xmlns:w16cex="http://schemas.microsoft.com/office/word/2018/wordml/cex" xmlns:w16cid="http://schemas.microsoft.com/office/word/2016/wordml/cid" xmlns:w16="http://schemas.microsoft.com/office/word/2018/wordml" xmlns:w16sdtdh="http://schemas.microsoft.com/office/word/2020/wordml/sdtdatahash" xmlns:w16se="http://schemas.microsoft.com/office/word/2015/wordml/symex" xmlns:wpg="http://schemas.microsoft.com/office/word/2010/wordprocessingGroup" xmlns:wpi="http://schemas.microsoft.com/office/word/2010/wordprocessingInk" xmlns:wne="http://schemas.microsoft.com/office/word/2006/wordml" xmlns:wps="http://schemas.microsoft.com/office/word/2010/wordprocessingShape" mc:Ignorable="w14 w15 w16se w16cid w16 w16cex w16sdtdh wp14">
   <w:p>
     <w:pPr>
       <w:pStyle w:val="Piedepgina"/>
@@ -488,7 +844,7 @@
 </file>
 
 <file path=word/footnotes.xml><?xml version="1.0" encoding="utf-8"?>
-<w:footnotes xmlns:wpc="http://schemas.microsoft.com/office/word/2010/wordprocessingCanvas" xmlns:cx="http://schemas.microsoft.com/office/drawing/2014/chartex" xmlns:cx1="http://schemas.microsoft.com/office/drawing/2015/9/8/chartex" xmlns:cx2="http://schemas.microsoft.com/office/drawing/2015/10/21/chartex" xmlns:cx3="http://schemas.microsoft.com/office/drawing/2016/5/9/chartex" xmlns:cx4="http://schemas.microsoft.com/office/drawing/2016/5/10/chartex" xmlns:cx5="http://schemas.microsoft.com/office/drawing/2016/5/11/chartex" xmlns:cx6="http://schemas.microsoft.com/office/drawing/2016/5/12/chartex" xmlns:cx7="http://schemas.microsoft.com/office/drawing/2016/5/13/chartex" xmlns:cx8="http://schemas.microsoft.com/office/drawing/2016/5/14/chartex" xmlns:mc="http://schemas.openxmlformats.org/markup-compatibility/2006" xmlns:aink="http://schemas.microsoft.com/office/drawing/2016/ink" xmlns:am3d="http://schemas.microsoft.com/office/drawing/2017/model3d" xmlns:o="urn:schemas-microsoft-com:office:office" xmlns:r="http://schemas.openxmlformats.org/officeDocument/2006/relationships" xmlns:m="http://schemas.openxmlformats.org/officeDocument/2006/math" xmlns:v="urn:schemas-microsoft-com:vml" xmlns:wp14="http://schemas.microsoft.com/office/word/2010/wordprocessingDrawing" xmlns:wp="http://schemas.openxmlformats.org/drawingml/2006/wordprocessingDrawing" xmlns:w10="urn:schemas-microsoft-com:office:word" xmlns:w="http://schemas.openxmlformats.org/wordprocessingml/2006/main" xmlns:w14="http://schemas.microsoft.com/office/word/2010/wordml" xmlns:w15="http://schemas.microsoft.com/office/word/2012/wordml" xmlns:w16cid="http://schemas.microsoft.com/office/word/2016/wordml/cid" xmlns:w16se="http://schemas.microsoft.com/office/word/2015/wordml/symex" xmlns:wpg="http://schemas.microsoft.com/office/word/2010/wordprocessingGroup" xmlns:wpi="http://schemas.microsoft.com/office/word/2010/wordprocessingInk" xmlns:wne="http://schemas.microsoft.com/office/word/2006/wordml" xmlns:wps="http://schemas.microsoft.com/office/word/2010/wordprocessingShape" mc:Ignorable="w14 w15 w16se w16cid wp14">
+<w:footnotes xmlns:wpc="http://schemas.microsoft.com/office/word/2010/wordprocessingCanvas" xmlns:cx="http://schemas.microsoft.com/office/drawing/2014/chartex" xmlns:cx1="http://schemas.microsoft.com/office/drawing/2015/9/8/chartex" xmlns:cx2="http://schemas.microsoft.com/office/drawing/2015/10/21/chartex" xmlns:cx3="http://schemas.microsoft.com/office/drawing/2016/5/9/chartex" xmlns:cx4="http://schemas.microsoft.com/office/drawing/2016/5/10/chartex" xmlns:cx5="http://schemas.microsoft.com/office/drawing/2016/5/11/chartex" xmlns:cx6="http://schemas.microsoft.com/office/drawing/2016/5/12/chartex" xmlns:cx7="http://schemas.microsoft.com/office/drawing/2016/5/13/chartex" xmlns:cx8="http://schemas.microsoft.com/office/drawing/2016/5/14/chartex" xmlns:mc="http://schemas.openxmlformats.org/markup-compatibility/2006" xmlns:aink="http://schemas.microsoft.com/office/drawing/2016/ink" xmlns:am3d="http://schemas.microsoft.com/office/drawing/2017/model3d" xmlns:o="urn:schemas-microsoft-com:office:office" xmlns:oel="http://schemas.microsoft.com/office/2019/extlst" xmlns:r="http://schemas.openxmlformats.org/officeDocument/2006/relationships" xmlns:m="http://schemas.openxmlformats.org/officeDocument/2006/math" xmlns:v="urn:schemas-microsoft-com:vml" xmlns:wp14="http://schemas.microsoft.com/office/word/2010/wordprocessingDrawing" xmlns:wp="http://schemas.openxmlformats.org/drawingml/2006/wordprocessingDrawing" xmlns:w10="urn:schemas-microsoft-com:office:word" xmlns:w="http://schemas.openxmlformats.org/wordprocessingml/2006/main" xmlns:w14="http://schemas.microsoft.com/office/word/2010/wordml" xmlns:w15="http://schemas.microsoft.com/office/word/2012/wordml" xmlns:w16cex="http://schemas.microsoft.com/office/word/2018/wordml/cex" xmlns:w16cid="http://schemas.microsoft.com/office/word/2016/wordml/cid" xmlns:w16="http://schemas.microsoft.com/office/word/2018/wordml" xmlns:w16sdtdh="http://schemas.microsoft.com/office/word/2020/wordml/sdtdatahash" xmlns:w16se="http://schemas.microsoft.com/office/word/2015/wordml/symex" xmlns:wpg="http://schemas.microsoft.com/office/word/2010/wordprocessingGroup" xmlns:wpi="http://schemas.microsoft.com/office/word/2010/wordprocessingInk" xmlns:wne="http://schemas.microsoft.com/office/word/2006/wordml" xmlns:wps="http://schemas.microsoft.com/office/word/2010/wordprocessingShape" mc:Ignorable="w14 w15 w16se w16cid w16 w16cex w16sdtdh wp14">
   <w:footnote w:type="separator" w:id="-1">
     <w:p>
       <w:pPr>
@@ -513,7 +869,7 @@
 </file>
 
 <file path=word/header1.xml><?xml version="1.0" encoding="utf-8"?>
-<w:hdr xmlns:wpc="http://schemas.microsoft.com/office/word/2010/wordprocessingCanvas" xmlns:cx="http://schemas.microsoft.com/office/drawing/2014/chartex" xmlns:cx1="http://schemas.microsoft.com/office/drawing/2015/9/8/chartex" xmlns:cx2="http://schemas.microsoft.com/office/drawing/2015/10/21/chartex" xmlns:cx3="http://schemas.microsoft.com/office/drawing/2016/5/9/chartex" xmlns:cx4="http://schemas.microsoft.com/office/drawing/2016/5/10/chartex" xmlns:cx5="http://schemas.microsoft.com/office/drawing/2016/5/11/chartex" xmlns:cx6="http://schemas.microsoft.com/office/drawing/2016/5/12/chartex" xmlns:cx7="http://schemas.microsoft.com/office/drawing/2016/5/13/chartex" xmlns:cx8="http://schemas.microsoft.com/office/drawing/2016/5/14/chartex" xmlns:mc="http://schemas.openxmlformats.org/markup-compatibility/2006" xmlns:aink="http://schemas.microsoft.com/office/drawing/2016/ink" xmlns:am3d="http://schemas.microsoft.com/office/drawing/2017/model3d" xmlns:o="urn:schemas-microsoft-com:office:office" xmlns:r="http://schemas.openxmlformats.org/officeDocument/2006/relationships" xmlns:m="http://schemas.openxmlformats.org/officeDocument/2006/math" xmlns:v="urn:schemas-microsoft-com:vml" xmlns:wp14="http://schemas.microsoft.com/office/word/2010/wordprocessingDrawing" xmlns:wp="http://schemas.openxmlformats.org/drawingml/2006/wordprocessingDrawing" xmlns:w10="urn:schemas-microsoft-com:office:word" xmlns:w="http://schemas.openxmlformats.org/wordprocessingml/2006/main" xmlns:w14="http://schemas.microsoft.com/office/word/2010/wordml" xmlns:w15="http://schemas.microsoft.com/office/word/2012/wordml" xmlns:w16cid="http://schemas.microsoft.com/office/word/2016/wordml/cid" xmlns:w16se="http://schemas.microsoft.com/office/word/2015/wordml/symex" xmlns:wpg="http://schemas.microsoft.com/office/word/2010/wordprocessingGroup" xmlns:wpi="http://schemas.microsoft.com/office/word/2010/wordprocessingInk" xmlns:wne="http://schemas.microsoft.com/office/word/2006/wordml" xmlns:wps="http://schemas.microsoft.com/office/word/2010/wordprocessingShape" mc:Ignorable="w14 w15 w16se w16cid wp14">
+<w:hdr xmlns:wpc="http://schemas.microsoft.com/office/word/2010/wordprocessingCanvas" xmlns:cx="http://schemas.microsoft.com/office/drawing/2014/chartex" xmlns:cx1="http://schemas.microsoft.com/office/drawing/2015/9/8/chartex" xmlns:cx2="http://schemas.microsoft.com/office/drawing/2015/10/21/chartex" xmlns:cx3="http://schemas.microsoft.com/office/drawing/2016/5/9/chartex" xmlns:cx4="http://schemas.microsoft.com/office/drawing/2016/5/10/chartex" xmlns:cx5="http://schemas.microsoft.com/office/drawing/2016/5/11/chartex" xmlns:cx6="http://schemas.microsoft.com/office/drawing/2016/5/12/chartex" xmlns:cx7="http://schemas.microsoft.com/office/drawing/2016/5/13/chartex" xmlns:cx8="http://schemas.microsoft.com/office/drawing/2016/5/14/chartex" xmlns:mc="http://schemas.openxmlformats.org/markup-compatibility/2006" xmlns:aink="http://schemas.microsoft.com/office/drawing/2016/ink" xmlns:am3d="http://schemas.microsoft.com/office/drawing/2017/model3d" xmlns:o="urn:schemas-microsoft-com:office:office" xmlns:oel="http://schemas.microsoft.com/office/2019/extlst" xmlns:r="http://schemas.openxmlformats.org/officeDocument/2006/relationships" xmlns:m="http://schemas.openxmlformats.org/officeDocument/2006/math" xmlns:v="urn:schemas-microsoft-com:vml" xmlns:wp14="http://schemas.microsoft.com/office/word/2010/wordprocessingDrawing" xmlns:wp="http://schemas.openxmlformats.org/drawingml/2006/wordprocessingDrawing" xmlns:w10="urn:schemas-microsoft-com:office:word" xmlns:w="http://schemas.openxmlformats.org/wordprocessingml/2006/main" xmlns:w14="http://schemas.microsoft.com/office/word/2010/wordml" xmlns:w15="http://schemas.microsoft.com/office/word/2012/wordml" xmlns:w16cex="http://schemas.microsoft.com/office/word/2018/wordml/cex" xmlns:w16cid="http://schemas.microsoft.com/office/word/2016/wordml/cid" xmlns:w16="http://schemas.microsoft.com/office/word/2018/wordml" xmlns:w16sdtdh="http://schemas.microsoft.com/office/word/2020/wordml/sdtdatahash" xmlns:w16se="http://schemas.microsoft.com/office/word/2015/wordml/symex" xmlns:wpg="http://schemas.microsoft.com/office/word/2010/wordprocessingGroup" xmlns:wpi="http://schemas.microsoft.com/office/word/2010/wordprocessingInk" xmlns:wne="http://schemas.microsoft.com/office/word/2006/wordml" xmlns:wps="http://schemas.microsoft.com/office/word/2010/wordprocessingShape" mc:Ignorable="w14 w15 w16se w16cid w16 w16cex w16sdtdh wp14">
   <w:p>
     <w:pPr>
       <w:pStyle w:val="Encabezado"/>
@@ -523,7 +879,7 @@
         <w:noProof/>
       </w:rPr>
       <w:drawing>
-        <wp:anchor distT="0" distB="0" distL="114300" distR="114300" simplePos="0" relativeHeight="251658240" behindDoc="0" locked="0" layoutInCell="1" allowOverlap="1" wp14:anchorId="13607A59">
+        <wp:anchor distT="0" distB="0" distL="114300" distR="114300" simplePos="0" relativeHeight="251658240" behindDoc="0" locked="0" layoutInCell="1" allowOverlap="1" wp14:anchorId="3C3E4670" wp14:editId="3C21128D">
           <wp:simplePos x="0" y="0"/>
           <wp:positionH relativeFrom="column">
             <wp:posOffset>266700</wp:posOffset>
@@ -584,7 +940,7 @@
 </file>
 
 <file path=word/numbering.xml><?xml version="1.0" encoding="utf-8"?>
-<w:numbering xmlns:wpc="http://schemas.microsoft.com/office/word/2010/wordprocessingCanvas" xmlns:cx="http://schemas.microsoft.com/office/drawing/2014/chartex" xmlns:cx1="http://schemas.microsoft.com/office/drawing/2015/9/8/chartex" xmlns:cx2="http://schemas.microsoft.com/office/drawing/2015/10/21/chartex" xmlns:cx3="http://schemas.microsoft.com/office/drawing/2016/5/9/chartex" xmlns:cx4="http://schemas.microsoft.com/office/drawing/2016/5/10/chartex" xmlns:cx5="http://schemas.microsoft.com/office/drawing/2016/5/11/chartex" xmlns:cx6="http://schemas.microsoft.com/office/drawing/2016/5/12/chartex" xmlns:cx7="http://schemas.microsoft.com/office/drawing/2016/5/13/chartex" xmlns:cx8="http://schemas.microsoft.com/office/drawing/2016/5/14/chartex" xmlns:mc="http://schemas.openxmlformats.org/markup-compatibility/2006" xmlns:aink="http://schemas.microsoft.com/office/drawing/2016/ink" xmlns:am3d="http://schemas.microsoft.com/office/drawing/2017/model3d" xmlns:o="urn:schemas-microsoft-com:office:office" xmlns:r="http://schemas.openxmlformats.org/officeDocument/2006/relationships" xmlns:m="http://schemas.openxmlformats.org/officeDocument/2006/math" xmlns:v="urn:schemas-microsoft-com:vml" xmlns:wp14="http://schemas.microsoft.com/office/word/2010/wordprocessingDrawing" xmlns:wp="http://schemas.openxmlformats.org/drawingml/2006/wordprocessingDrawing" xmlns:w10="urn:schemas-microsoft-com:office:word" xmlns:w="http://schemas.openxmlformats.org/wordprocessingml/2006/main" xmlns:w14="http://schemas.microsoft.com/office/word/2010/wordml" xmlns:w15="http://schemas.microsoft.com/office/word/2012/wordml" xmlns:w16cid="http://schemas.microsoft.com/office/word/2016/wordml/cid" xmlns:w16se="http://schemas.microsoft.com/office/word/2015/wordml/symex" xmlns:wpg="http://schemas.microsoft.com/office/word/2010/wordprocessingGroup" xmlns:wpi="http://schemas.microsoft.com/office/word/2010/wordprocessingInk" xmlns:wne="http://schemas.microsoft.com/office/word/2006/wordml" xmlns:wps="http://schemas.microsoft.com/office/word/2010/wordprocessingShape" mc:Ignorable="w14 w15 w16se w16cid wp14">
+<w:numbering xmlns:wpc="http://schemas.microsoft.com/office/word/2010/wordprocessingCanvas" xmlns:cx="http://schemas.microsoft.com/office/drawing/2014/chartex" xmlns:cx1="http://schemas.microsoft.com/office/drawing/2015/9/8/chartex" xmlns:cx2="http://schemas.microsoft.com/office/drawing/2015/10/21/chartex" xmlns:cx3="http://schemas.microsoft.com/office/drawing/2016/5/9/chartex" xmlns:cx4="http://schemas.microsoft.com/office/drawing/2016/5/10/chartex" xmlns:cx5="http://schemas.microsoft.com/office/drawing/2016/5/11/chartex" xmlns:cx6="http://schemas.microsoft.com/office/drawing/2016/5/12/chartex" xmlns:cx7="http://schemas.microsoft.com/office/drawing/2016/5/13/chartex" xmlns:cx8="http://schemas.microsoft.com/office/drawing/2016/5/14/chartex" xmlns:mc="http://schemas.openxmlformats.org/markup-compatibility/2006" xmlns:aink="http://schemas.microsoft.com/office/drawing/2016/ink" xmlns:am3d="http://schemas.microsoft.com/office/drawing/2017/model3d" xmlns:o="urn:schemas-microsoft-com:office:office" xmlns:oel="http://schemas.microsoft.com/office/2019/extlst" xmlns:r="http://schemas.openxmlformats.org/officeDocument/2006/relationships" xmlns:m="http://schemas.openxmlformats.org/officeDocument/2006/math" xmlns:v="urn:schemas-microsoft-com:vml" xmlns:wp14="http://schemas.microsoft.com/office/word/2010/wordprocessingDrawing" xmlns:wp="http://schemas.openxmlformats.org/drawingml/2006/wordprocessingDrawing" xmlns:w10="urn:schemas-microsoft-com:office:word" xmlns:w="http://schemas.openxmlformats.org/wordprocessingml/2006/main" xmlns:w14="http://schemas.microsoft.com/office/word/2010/wordml" xmlns:w15="http://schemas.microsoft.com/office/word/2012/wordml" xmlns:w16cex="http://schemas.microsoft.com/office/word/2018/wordml/cex" xmlns:w16cid="http://schemas.microsoft.com/office/word/2016/wordml/cid" xmlns:w16="http://schemas.microsoft.com/office/word/2018/wordml" xmlns:w16sdtdh="http://schemas.microsoft.com/office/word/2020/wordml/sdtdatahash" xmlns:w16se="http://schemas.microsoft.com/office/word/2015/wordml/symex" xmlns:wpg="http://schemas.microsoft.com/office/word/2010/wordprocessingGroup" xmlns:wpi="http://schemas.microsoft.com/office/word/2010/wordprocessingInk" xmlns:wne="http://schemas.microsoft.com/office/word/2006/wordml" xmlns:wps="http://schemas.microsoft.com/office/word/2010/wordprocessingShape" mc:Ignorable="w14 w15 w16se w16cid w16 w16cex w16sdtdh wp14">
   <w:abstractNum w:abstractNumId="0" w15:restartNumberingAfterBreak="0">
     <w:nsid w:val="FFFFFF7C"/>
     <w:multiLevelType w:val="singleLevel"/>
@@ -756,38 +1112,38 @@
       </w:rPr>
     </w:lvl>
   </w:abstractNum>
-  <w:num w:numId="1">
+  <w:num w:numId="1" w16cid:durableId="2144154875">
     <w:abstractNumId w:val="8"/>
   </w:num>
-  <w:num w:numId="2">
+  <w:num w:numId="2" w16cid:durableId="897280918">
     <w:abstractNumId w:val="6"/>
   </w:num>
-  <w:num w:numId="3">
+  <w:num w:numId="3" w16cid:durableId="371662263">
     <w:abstractNumId w:val="5"/>
   </w:num>
-  <w:num w:numId="4">
+  <w:num w:numId="4" w16cid:durableId="1596210714">
     <w:abstractNumId w:val="4"/>
   </w:num>
-  <w:num w:numId="5">
+  <w:num w:numId="5" w16cid:durableId="1880163022">
     <w:abstractNumId w:val="7"/>
   </w:num>
-  <w:num w:numId="6">
+  <w:num w:numId="6" w16cid:durableId="834733968">
     <w:abstractNumId w:val="3"/>
   </w:num>
-  <w:num w:numId="7">
+  <w:num w:numId="7" w16cid:durableId="2015104848">
     <w:abstractNumId w:val="2"/>
   </w:num>
-  <w:num w:numId="8">
+  <w:num w:numId="8" w16cid:durableId="325670340">
     <w:abstractNumId w:val="1"/>
   </w:num>
-  <w:num w:numId="9">
+  <w:num w:numId="9" w16cid:durableId="1974365933">
     <w:abstractNumId w:val="0"/>
   </w:num>
 </w:numbering>
 </file>
 
 <file path=word/styles.xml><?xml version="1.0" encoding="utf-8"?>
-<w:styles xmlns:mc="http://schemas.openxmlformats.org/markup-compatibility/2006" xmlns:r="http://schemas.openxmlformats.org/officeDocument/2006/relationships" xmlns:w="http://schemas.openxmlformats.org/wordprocessingml/2006/main" xmlns:w14="http://schemas.microsoft.com/office/word/2010/wordml" xmlns:w15="http://schemas.microsoft.com/office/word/2012/wordml" xmlns:w16cid="http://schemas.microsoft.com/office/word/2016/wordml/cid" xmlns:w16se="http://schemas.microsoft.com/office/word/2015/wordml/symex" mc:Ignorable="w14 w15 w16se w16cid">
+<w:styles xmlns:mc="http://schemas.openxmlformats.org/markup-compatibility/2006" xmlns:r="http://schemas.openxmlformats.org/officeDocument/2006/relationships" xmlns:w="http://schemas.openxmlformats.org/wordprocessingml/2006/main" xmlns:w14="http://schemas.microsoft.com/office/word/2010/wordml" xmlns:w15="http://schemas.microsoft.com/office/word/2012/wordml" xmlns:w16cex="http://schemas.microsoft.com/office/word/2018/wordml/cex" xmlns:w16cid="http://schemas.microsoft.com/office/word/2016/wordml/cid" xmlns:w16="http://schemas.microsoft.com/office/word/2018/wordml" xmlns:w16sdtdh="http://schemas.microsoft.com/office/word/2020/wordml/sdtdatahash" xmlns:w16se="http://schemas.microsoft.com/office/word/2015/wordml/symex" mc:Ignorable="w14 w15 w16se w16cid w16 w16cex w16sdtdh">
   <w:docDefaults>
     <w:rPrDefault>
       <w:rPr>
@@ -803,7 +1159,7 @@
       </w:pPr>
     </w:pPrDefault>
   </w:docDefaults>
-  <w:latentStyles w:defLockedState="0" w:defUIPriority="99" w:defSemiHidden="0" w:defUnhideWhenUsed="0" w:defQFormat="0" w:count="375">
+  <w:latentStyles w:defLockedState="0" w:defUIPriority="99" w:defSemiHidden="0" w:defUnhideWhenUsed="0" w:defQFormat="0" w:count="376">
     <w:lsdException w:name="Normal" w:uiPriority="0" w:qFormat="1"/>
     <w:lsdException w:name="heading 1" w:uiPriority="9" w:qFormat="1"/>
     <w:lsdException w:name="heading 2" w:semiHidden="1" w:uiPriority="9" w:unhideWhenUsed="1" w:qFormat="1"/>
@@ -1170,6 +1526,7 @@
     <w:lsdException w:name="Smart Hyperlink" w:semiHidden="1" w:unhideWhenUsed="1"/>
     <w:lsdException w:name="Hashtag" w:semiHidden="1" w:unhideWhenUsed="1"/>
     <w:lsdException w:name="Unresolved Mention" w:semiHidden="1" w:unhideWhenUsed="1"/>
+    <w:lsdException w:name="Smart Link" w:semiHidden="1" w:unhideWhenUsed="1"/>
   </w:latentStyles>
   <w:style w:type="paragraph" w:default="1" w:styleId="Normal">
     <w:name w:val="Normal"/>

</xml_diff>